<commit_message>
Updated to correct error handling.
git-svn-id: http://10.105.1.46/svn/CCRT/Ccrt/branches/Common3700@24505 80089e14-fa6c-c64e-badd-1f0333e23b03
</commit_message>
<xml_diff>
--- a/Source/Toyota/ToyotaParameterEditing.docx
+++ b/Source/Toyota/ToyotaParameterEditing.docx
@@ -81,119 +81,6 @@
             <wp:extent cx="4494362" cy="3677118"/>
             <wp:effectExtent l="0" t="0" r="1905" b="0"/>
             <wp:docPr id="1" name="Picture 1"/>
-            <wp:cNvGraphicFramePr>
-              <a:graphicFrameLocks xmlns:a="http://schemas.openxmlformats.org/drawingml/2006/main" noChangeAspect="1"/>
-            </wp:cNvGraphicFramePr>
-            <a:graphic xmlns:a="http://schemas.openxmlformats.org/drawingml/2006/main">
-              <a:graphicData uri="http://schemas.openxmlformats.org/drawingml/2006/picture">
-                <pic:pic xmlns:pic="http://schemas.openxmlformats.org/drawingml/2006/picture">
-                  <pic:nvPicPr>
-                    <pic:cNvPr id="0" name=""/>
-                    <pic:cNvPicPr/>
-                  </pic:nvPicPr>
-                  <pic:blipFill>
-                    <a:blip r:embed="rId5"/>
-                    <a:stretch>
-                      <a:fillRect/>
-                    </a:stretch>
-                  </pic:blipFill>
-                  <pic:spPr>
-                    <a:xfrm>
-                      <a:off x="0" y="0"/>
-                      <a:ext cx="4494362" cy="3677118"/>
-                    </a:xfrm>
-                    <a:prstGeom prst="rect">
-                      <a:avLst/>
-                    </a:prstGeom>
-                  </pic:spPr>
-                </pic:pic>
-              </a:graphicData>
-            </a:graphic>
-          </wp:inline>
-        </w:drawing>
-      </w:r>
-    </w:p>
-    <w:p>
-      <w:pPr>
-        <w:jc w:val="center"/>
-        <w:rPr>
-          <w:sz w:val="16"/>
-          <w:szCs w:val="16"/>
-        </w:rPr>
-      </w:pPr>
-      <w:r>
-        <w:rPr>
-          <w:b/>
-          <w:i/>
-          <w:sz w:val="16"/>
-          <w:szCs w:val="16"/>
-        </w:rPr>
-        <w:t>Figure 1</w:t>
-      </w:r>
-    </w:p>
-    <w:p>
-      <w:pPr>
-        <w:jc w:val="center"/>
-        <w:rPr>
-          <w:sz w:val="16"/>
-          <w:szCs w:val="16"/>
-        </w:rPr>
-      </w:pPr>
-    </w:p>
-    <w:p>
-      <w:r>
-        <w:rPr>
-          <w:b/>
-          <w:i/>
-        </w:rPr>
-        <w:t>Figure 2</w:t>
-      </w:r>
-      <w:r>
-        <w:t xml:space="preserve"> shows the parameter editor after opening the Camry parameter file.  The </w:t>
-      </w:r>
-      <w:r>
-        <w:rPr>
-          <w:b/>
-        </w:rPr>
-        <w:t>Brake Parameters</w:t>
-      </w:r>
-      <w:r>
-        <w:t xml:space="preserve"> section is only used on the brake test machines.  The </w:t>
-      </w:r>
-      <w:r>
-        <w:rPr>
-          <w:b/>
-        </w:rPr>
-        <w:t>Speed Targets</w:t>
-      </w:r>
-      <w:r>
-        <w:t xml:space="preserve"> and </w:t>
-      </w:r>
-      <w:r>
-        <w:rPr>
-          <w:b/>
-        </w:rPr>
-        <w:t>Transmission Shift Points</w:t>
-      </w:r>
-      <w:r>
-        <w:t xml:space="preserve"> parameters are only used on the roller drum machines.</w:t>
-      </w:r>
-    </w:p>
-    <w:p/>
-    <w:p>
-      <w:pPr>
-        <w:jc w:val="center"/>
-      </w:pPr>
-      <w:r>
-        <w:rPr>
-          <w:noProof/>
-        </w:rPr>
-        <w:lastRenderedPageBreak/>
-        <w:drawing>
-          <wp:inline distT="0" distB="0" distL="0" distR="0" wp14:anchorId="11821A52" wp14:editId="5E1F3232">
-            <wp:extent cx="4727275" cy="3867679"/>
-            <wp:effectExtent l="0" t="0" r="0" b="0"/>
-            <wp:docPr id="2" name="Picture 2"/>
             <wp:cNvGraphicFramePr>
               <a:graphicFrameLocks xmlns:a="http://schemas.openxmlformats.org/drawingml/2006/main" noChangeAspect="1"/>
             </wp:cNvGraphicFramePr>
@@ -213,7 +100,7 @@
                   <pic:spPr>
                     <a:xfrm>
                       <a:off x="0" y="0"/>
-                      <a:ext cx="4727275" cy="3867679"/>
+                      <a:ext cx="4494362" cy="3677118"/>
                     </a:xfrm>
                     <a:prstGeom prst="rect">
                       <a:avLst/>
@@ -241,7 +128,7 @@
           <w:sz w:val="16"/>
           <w:szCs w:val="16"/>
         </w:rPr>
-        <w:t>Figure 2</w:t>
+        <w:t>Figure 1</w:t>
       </w:r>
     </w:p>
     <w:p>
@@ -255,6 +142,119 @@
     </w:p>
     <w:p>
       <w:r>
+        <w:rPr>
+          <w:b/>
+          <w:i/>
+        </w:rPr>
+        <w:t>Figure 2</w:t>
+      </w:r>
+      <w:r>
+        <w:t xml:space="preserve"> shows the parameter editor after opening the Camry parameter file.  The </w:t>
+      </w:r>
+      <w:r>
+        <w:rPr>
+          <w:b/>
+        </w:rPr>
+        <w:t>Brake Parameters</w:t>
+      </w:r>
+      <w:r>
+        <w:t xml:space="preserve"> section is only used on the brake test machines.  The </w:t>
+      </w:r>
+      <w:r>
+        <w:rPr>
+          <w:b/>
+        </w:rPr>
+        <w:t>Speed Targets</w:t>
+      </w:r>
+      <w:r>
+        <w:t xml:space="preserve"> and </w:t>
+      </w:r>
+      <w:r>
+        <w:rPr>
+          <w:b/>
+        </w:rPr>
+        <w:t>Transmission Shift Points</w:t>
+      </w:r>
+      <w:r>
+        <w:t xml:space="preserve"> parameters are only used on the roller drum machines.</w:t>
+      </w:r>
+    </w:p>
+    <w:p/>
+    <w:p>
+      <w:pPr>
+        <w:jc w:val="center"/>
+      </w:pPr>
+      <w:r>
+        <w:rPr>
+          <w:noProof/>
+        </w:rPr>
+        <w:lastRenderedPageBreak/>
+        <w:drawing>
+          <wp:inline distT="0" distB="0" distL="0" distR="0" wp14:anchorId="11821A52" wp14:editId="5E1F3232">
+            <wp:extent cx="4459962" cy="3648974"/>
+            <wp:effectExtent l="0" t="0" r="0" b="8890"/>
+            <wp:docPr id="2" name="Picture 2"/>
+            <wp:cNvGraphicFramePr>
+              <a:graphicFrameLocks xmlns:a="http://schemas.openxmlformats.org/drawingml/2006/main" noChangeAspect="1"/>
+            </wp:cNvGraphicFramePr>
+            <a:graphic xmlns:a="http://schemas.openxmlformats.org/drawingml/2006/main">
+              <a:graphicData uri="http://schemas.openxmlformats.org/drawingml/2006/picture">
+                <pic:pic xmlns:pic="http://schemas.openxmlformats.org/drawingml/2006/picture">
+                  <pic:nvPicPr>
+                    <pic:cNvPr id="0" name=""/>
+                    <pic:cNvPicPr/>
+                  </pic:nvPicPr>
+                  <pic:blipFill>
+                    <a:blip r:embed="rId7"/>
+                    <a:stretch>
+                      <a:fillRect/>
+                    </a:stretch>
+                  </pic:blipFill>
+                  <pic:spPr>
+                    <a:xfrm>
+                      <a:off x="0" y="0"/>
+                      <a:ext cx="4463476" cy="3651849"/>
+                    </a:xfrm>
+                    <a:prstGeom prst="rect">
+                      <a:avLst/>
+                    </a:prstGeom>
+                  </pic:spPr>
+                </pic:pic>
+              </a:graphicData>
+            </a:graphic>
+          </wp:inline>
+        </w:drawing>
+      </w:r>
+    </w:p>
+    <w:p>
+      <w:pPr>
+        <w:jc w:val="center"/>
+        <w:rPr>
+          <w:sz w:val="16"/>
+          <w:szCs w:val="16"/>
+        </w:rPr>
+      </w:pPr>
+      <w:r>
+        <w:rPr>
+          <w:b/>
+          <w:i/>
+          <w:sz w:val="16"/>
+          <w:szCs w:val="16"/>
+        </w:rPr>
+        <w:t>Figure 2</w:t>
+      </w:r>
+    </w:p>
+    <w:p>
+      <w:pPr>
+        <w:jc w:val="center"/>
+        <w:rPr>
+          <w:sz w:val="16"/>
+          <w:szCs w:val="16"/>
+        </w:rPr>
+      </w:pPr>
+    </w:p>
+    <w:p>
+      <w:r>
         <w:t xml:space="preserve">After making any changes, select </w:t>
       </w:r>
       <w:r>
@@ -273,12 +273,182 @@
         <w:t>File</w:t>
       </w:r>
       <w:r>
-        <w:t xml:space="preserve"> menu.  You can also choose to export the parameter files to a memory stick for installation on the other machines.  The import and export items can be found under the File menu.</w:t>
-      </w:r>
+        <w:t xml:space="preserve"> menu.  You can also choose to export the parameter files to a memory stick for installation on the other machines.  The import and export items can be found under the File menu. </w:t>
+      </w:r>
+    </w:p>
+    <w:p/>
+    <w:p>
       <w:bookmarkStart w:id="0" w:name="_GoBack"/>
       <w:bookmarkEnd w:id="0"/>
-      <w:r>
-        <w:t xml:space="preserve"> </w:t>
+    </w:p>
+    <w:p>
+      <w:r>
+        <w:rPr>
+          <w:b/>
+        </w:rPr>
+        <w:t>Adding a New Vehicle:</w:t>
+      </w:r>
+    </w:p>
+    <w:p>
+      <w:pPr>
+        <w:pStyle w:val="ListParagraph"/>
+        <w:numPr>
+          <w:ilvl w:val="0"/>
+          <w:numId w:val="1"/>
+        </w:numPr>
+      </w:pPr>
+      <w:r>
+        <w:t>From the File menu, select New Vehicle.  The following dialog box will be displayed:</w:t>
+      </w:r>
+    </w:p>
+    <w:p>
+      <w:pPr>
+        <w:pStyle w:val="ListParagraph"/>
+        <w:numPr>
+          <w:ilvl w:val="1"/>
+          <w:numId w:val="1"/>
+        </w:numPr>
+      </w:pPr>
+      <w:r>
+        <w:rPr>
+          <w:noProof/>
+        </w:rPr>
+        <w:drawing>
+          <wp:inline distT="0" distB="0" distL="0" distR="0" wp14:anchorId="6C123455" wp14:editId="116E8C7B">
+            <wp:extent cx="2076302" cy="1647646"/>
+            <wp:effectExtent l="0" t="0" r="635" b="0"/>
+            <wp:docPr id="3" name="Picture 3"/>
+            <wp:cNvGraphicFramePr>
+              <a:graphicFrameLocks xmlns:a="http://schemas.openxmlformats.org/drawingml/2006/main" noChangeAspect="1"/>
+            </wp:cNvGraphicFramePr>
+            <a:graphic xmlns:a="http://schemas.openxmlformats.org/drawingml/2006/main">
+              <a:graphicData uri="http://schemas.openxmlformats.org/drawingml/2006/picture">
+                <pic:pic xmlns:pic="http://schemas.openxmlformats.org/drawingml/2006/picture">
+                  <pic:nvPicPr>
+                    <pic:cNvPr id="0" name=""/>
+                    <pic:cNvPicPr/>
+                  </pic:nvPicPr>
+                  <pic:blipFill>
+                    <a:blip r:embed="rId8"/>
+                    <a:stretch>
+                      <a:fillRect/>
+                    </a:stretch>
+                  </pic:blipFill>
+                  <pic:spPr>
+                    <a:xfrm>
+                      <a:off x="0" y="0"/>
+                      <a:ext cx="2081887" cy="1652078"/>
+                    </a:xfrm>
+                    <a:prstGeom prst="rect">
+                      <a:avLst/>
+                    </a:prstGeom>
+                  </pic:spPr>
+                </pic:pic>
+              </a:graphicData>
+            </a:graphic>
+          </wp:inline>
+        </w:drawing>
+      </w:r>
+    </w:p>
+    <w:p>
+      <w:pPr>
+        <w:pStyle w:val="ListParagraph"/>
+        <w:numPr>
+          <w:ilvl w:val="0"/>
+          <w:numId w:val="1"/>
+        </w:numPr>
+      </w:pPr>
+      <w:r>
+        <w:t>Type in the new Vehicle name.</w:t>
+      </w:r>
+    </w:p>
+    <w:p>
+      <w:pPr>
+        <w:pStyle w:val="ListParagraph"/>
+        <w:numPr>
+          <w:ilvl w:val="1"/>
+          <w:numId w:val="1"/>
+        </w:numPr>
+      </w:pPr>
+      <w:r>
+        <w:rPr>
+          <w:b/>
+          <w:u w:val="single"/>
+        </w:rPr>
+        <w:t>WARNING:</w:t>
+      </w:r>
+      <w:r>
+        <w:t xml:space="preserve">  Vehicle names </w:t>
+      </w:r>
+      <w:r>
+        <w:rPr>
+          <w:b/>
+          <w:i/>
+        </w:rPr>
+        <w:t>must</w:t>
+      </w:r>
+      <w:r>
+        <w:t xml:space="preserve"> start with a letter, not a number.</w:t>
+      </w:r>
+    </w:p>
+    <w:p>
+      <w:pPr>
+        <w:pStyle w:val="ListParagraph"/>
+        <w:numPr>
+          <w:ilvl w:val="0"/>
+          <w:numId w:val="1"/>
+        </w:numPr>
+      </w:pPr>
+      <w:r>
+        <w:t>Select the button to be used for the vehicle selection.  This button number should correspond to a button number on the device the operator uses to select vehicle type.</w:t>
+      </w:r>
+    </w:p>
+    <w:p>
+      <w:pPr>
+        <w:pStyle w:val="ListParagraph"/>
+        <w:numPr>
+          <w:ilvl w:val="0"/>
+          <w:numId w:val="1"/>
+        </w:numPr>
+      </w:pPr>
+      <w:r>
+        <w:t>Select an image to be displayed on the screen when this particular vehicle type is selected.</w:t>
+      </w:r>
+    </w:p>
+    <w:p>
+      <w:pPr>
+        <w:pStyle w:val="ListParagraph"/>
+        <w:numPr>
+          <w:ilvl w:val="0"/>
+          <w:numId w:val="1"/>
+        </w:numPr>
+      </w:pPr>
+      <w:r>
+        <w:t>Select the appropriate drive train type for the vehicle</w:t>
+      </w:r>
+    </w:p>
+    <w:p>
+      <w:pPr>
+        <w:pStyle w:val="ListParagraph"/>
+        <w:numPr>
+          <w:ilvl w:val="0"/>
+          <w:numId w:val="1"/>
+        </w:numPr>
+      </w:pPr>
+      <w:r>
+        <w:t>Click the Done button.</w:t>
+      </w:r>
+    </w:p>
+    <w:p>
+      <w:pPr>
+        <w:pStyle w:val="ListParagraph"/>
+        <w:numPr>
+          <w:ilvl w:val="0"/>
+          <w:numId w:val="1"/>
+        </w:numPr>
+      </w:pPr>
+      <w:r>
+        <w:t>The main screen should now show the selected logo and available parameters for modification.</w:t>
       </w:r>
     </w:p>
     <w:sectPr>
@@ -289,6 +459,103 @@
     </w:sectPr>
   </w:body>
 </w:document>
+</file>
+
+<file path=word/numbering.xml><?xml version="1.0" encoding="utf-8"?>
+<w:numbering xmlns:wpc="http://schemas.microsoft.com/office/word/2010/wordprocessingCanvas" xmlns:mc="http://schemas.openxmlformats.org/markup-compatibility/2006" xmlns:o="urn:schemas-microsoft-com:office:office" xmlns:r="http://schemas.openxmlformats.org/officeDocument/2006/relationships" xmlns:m="http://schemas.openxmlformats.org/officeDocument/2006/math" xmlns:v="urn:schemas-microsoft-com:vml" xmlns:wp14="http://schemas.microsoft.com/office/word/2010/wordprocessingDrawing" xmlns:wp="http://schemas.openxmlformats.org/drawingml/2006/wordprocessingDrawing" xmlns:w10="urn:schemas-microsoft-com:office:word" xmlns:w="http://schemas.openxmlformats.org/wordprocessingml/2006/main" xmlns:w14="http://schemas.microsoft.com/office/word/2010/wordml" xmlns:wpg="http://schemas.microsoft.com/office/word/2010/wordprocessingGroup" xmlns:wpi="http://schemas.microsoft.com/office/word/2010/wordprocessingInk" xmlns:wne="http://schemas.microsoft.com/office/word/2006/wordml" xmlns:wps="http://schemas.microsoft.com/office/word/2010/wordprocessingShape" mc:Ignorable="w14 wp14">
+  <w:abstractNum w:abstractNumId="0">
+    <w:nsid w:val="44150EF1"/>
+    <w:multiLevelType w:val="hybridMultilevel"/>
+    <w:tmpl w:val="337EB27C"/>
+    <w:lvl w:ilvl="0" w:tplc="0409000F">
+      <w:start w:val="1"/>
+      <w:numFmt w:val="decimal"/>
+      <w:lvlText w:val="%1."/>
+      <w:lvlJc w:val="left"/>
+      <w:pPr>
+        <w:ind w:left="720" w:hanging="360"/>
+      </w:pPr>
+      <w:rPr>
+        <w:rFonts w:hint="default"/>
+      </w:rPr>
+    </w:lvl>
+    <w:lvl w:ilvl="1" w:tplc="04090019">
+      <w:start w:val="1"/>
+      <w:numFmt w:val="lowerLetter"/>
+      <w:lvlText w:val="%2."/>
+      <w:lvlJc w:val="left"/>
+      <w:pPr>
+        <w:ind w:left="1440" w:hanging="360"/>
+      </w:pPr>
+    </w:lvl>
+    <w:lvl w:ilvl="2" w:tplc="0409001B" w:tentative="1">
+      <w:start w:val="1"/>
+      <w:numFmt w:val="lowerRoman"/>
+      <w:lvlText w:val="%3."/>
+      <w:lvlJc w:val="right"/>
+      <w:pPr>
+        <w:ind w:left="2160" w:hanging="180"/>
+      </w:pPr>
+    </w:lvl>
+    <w:lvl w:ilvl="3" w:tplc="0409000F" w:tentative="1">
+      <w:start w:val="1"/>
+      <w:numFmt w:val="decimal"/>
+      <w:lvlText w:val="%4."/>
+      <w:lvlJc w:val="left"/>
+      <w:pPr>
+        <w:ind w:left="2880" w:hanging="360"/>
+      </w:pPr>
+    </w:lvl>
+    <w:lvl w:ilvl="4" w:tplc="04090019" w:tentative="1">
+      <w:start w:val="1"/>
+      <w:numFmt w:val="lowerLetter"/>
+      <w:lvlText w:val="%5."/>
+      <w:lvlJc w:val="left"/>
+      <w:pPr>
+        <w:ind w:left="3600" w:hanging="360"/>
+      </w:pPr>
+    </w:lvl>
+    <w:lvl w:ilvl="5" w:tplc="0409001B" w:tentative="1">
+      <w:start w:val="1"/>
+      <w:numFmt w:val="lowerRoman"/>
+      <w:lvlText w:val="%6."/>
+      <w:lvlJc w:val="right"/>
+      <w:pPr>
+        <w:ind w:left="4320" w:hanging="180"/>
+      </w:pPr>
+    </w:lvl>
+    <w:lvl w:ilvl="6" w:tplc="0409000F" w:tentative="1">
+      <w:start w:val="1"/>
+      <w:numFmt w:val="decimal"/>
+      <w:lvlText w:val="%7."/>
+      <w:lvlJc w:val="left"/>
+      <w:pPr>
+        <w:ind w:left="5040" w:hanging="360"/>
+      </w:pPr>
+    </w:lvl>
+    <w:lvl w:ilvl="7" w:tplc="04090019" w:tentative="1">
+      <w:start w:val="1"/>
+      <w:numFmt w:val="lowerLetter"/>
+      <w:lvlText w:val="%8."/>
+      <w:lvlJc w:val="left"/>
+      <w:pPr>
+        <w:ind w:left="5760" w:hanging="360"/>
+      </w:pPr>
+    </w:lvl>
+    <w:lvl w:ilvl="8" w:tplc="0409001B" w:tentative="1">
+      <w:start w:val="1"/>
+      <w:numFmt w:val="lowerRoman"/>
+      <w:lvlText w:val="%9."/>
+      <w:lvlJc w:val="right"/>
+      <w:pPr>
+        <w:ind w:left="6480" w:hanging="180"/>
+      </w:pPr>
+    </w:lvl>
+  </w:abstractNum>
+  <w:num w:numId="1">
+    <w:abstractNumId w:val="0"/>
+  </w:num>
+</w:numbering>
 </file>
 
 <file path=word/styles.xml><?xml version="1.0" encoding="utf-8"?>
@@ -500,6 +767,17 @@
       <w:sz w:val="16"/>
       <w:szCs w:val="16"/>
     </w:rPr>
+  </w:style>
+  <w:style w:type="paragraph" w:styleId="ListParagraph">
+    <w:name w:val="List Paragraph"/>
+    <w:basedOn w:val="Normal"/>
+    <w:uiPriority w:val="34"/>
+    <w:qFormat/>
+    <w:rsid w:val="00EE56DF"/>
+    <w:pPr>
+      <w:ind w:left="720"/>
+      <w:contextualSpacing/>
+    </w:pPr>
   </w:style>
 </w:styles>
 </file>
@@ -713,6 +991,17 @@
       <w:sz w:val="16"/>
       <w:szCs w:val="16"/>
     </w:rPr>
+  </w:style>
+  <w:style w:type="paragraph" w:styleId="ListParagraph">
+    <w:name w:val="List Paragraph"/>
+    <w:basedOn w:val="Normal"/>
+    <w:uiPriority w:val="34"/>
+    <w:qFormat/>
+    <w:rsid w:val="00EE56DF"/>
+    <w:pPr>
+      <w:ind w:left="720"/>
+      <w:contextualSpacing/>
+    </w:pPr>
   </w:style>
 </w:styles>
 </file>

</xml_diff>